<commit_message>
feat: enhance add employee form with manager rights checkbox styling and update move buttons in employee tree
</commit_message>
<xml_diff>
--- a/demo_aplikace.docx
+++ b/demo_aplikace.docx
@@ -888,42 +888,135 @@
       </w:pPr>
       <w:r>
         <w:rPr/>
-      </w:r>
-    </w:p>
-    <w:p>
-      <w:pPr>
-        <w:pStyle w:val="BodyText"/>
-        <w:bidi w:val="0"/>
-        <w:spacing w:lineRule="auto" w:line="276" w:before="0" w:after="140"/>
-        <w:jc w:val="start"/>
-        <w:rPr/>
-      </w:pPr>
-      <w:r>
-        <w:rPr/>
-      </w:r>
-    </w:p>
-    <w:p>
-      <w:pPr>
-        <w:pStyle w:val="BodyText"/>
-        <w:bidi w:val="0"/>
-        <w:spacing w:lineRule="auto" w:line="276" w:before="0" w:after="140"/>
-        <w:jc w:val="start"/>
-        <w:rPr/>
-      </w:pPr>
-      <w:r>
-        <w:rPr/>
-      </w:r>
-    </w:p>
-    <w:p>
-      <w:pPr>
-        <w:pStyle w:val="BodyText"/>
-        <w:bidi w:val="0"/>
-        <w:spacing w:lineRule="auto" w:line="276" w:before="0" w:after="140"/>
-        <w:jc w:val="start"/>
-        <w:rPr/>
-      </w:pPr>
-      <w:r>
-        <w:rPr/>
+        <w:drawing>
+          <wp:anchor distT="0" distB="0" distL="0" distR="0" simplePos="0" relativeHeight="12" behindDoc="0" locked="0" layoutInCell="0" allowOverlap="1">
+            <wp:simplePos x="0" y="0"/>
+            <wp:positionH relativeFrom="column">
+              <wp:align>center</wp:align>
+            </wp:positionH>
+            <wp:positionV relativeFrom="paragraph">
+              <wp:posOffset>635</wp:posOffset>
+            </wp:positionV>
+            <wp:extent cx="6120130" cy="3824605"/>
+            <wp:effectExtent l="0" t="0" r="0" b="0"/>
+            <wp:wrapSquare wrapText="largest"/>
+            <wp:docPr id="10" name="Image11"/>
+            <wp:cNvGraphicFramePr>
+              <a:graphicFrameLocks xmlns:a="http://schemas.openxmlformats.org/drawingml/2006/main" noChangeAspect="1"/>
+            </wp:cNvGraphicFramePr>
+            <a:graphic xmlns:a="http://schemas.openxmlformats.org/drawingml/2006/main">
+              <a:graphicData uri="http://schemas.openxmlformats.org/drawingml/2006/picture">
+                <pic:pic xmlns:pic="http://schemas.openxmlformats.org/drawingml/2006/picture">
+                  <pic:nvPicPr>
+                    <pic:cNvPr id="10" name="Image11"/>
+                    <pic:cNvPicPr>
+                      <a:picLocks noChangeAspect="1" noChangeArrowheads="1"/>
+                    </pic:cNvPicPr>
+                  </pic:nvPicPr>
+                  <pic:blipFill>
+                    <a:blip r:embed="rId11"/>
+                    <a:stretch>
+                      <a:fillRect/>
+                    </a:stretch>
+                  </pic:blipFill>
+                  <pic:spPr bwMode="auto">
+                    <a:xfrm>
+                      <a:off x="0" y="0"/>
+                      <a:ext cx="6120130" cy="3824605"/>
+                    </a:xfrm>
+                    <a:prstGeom prst="rect">
+                      <a:avLst/>
+                    </a:prstGeom>
+                    <a:noFill/>
+                  </pic:spPr>
+                </pic:pic>
+              </a:graphicData>
+            </a:graphic>
+          </wp:anchor>
+        </w:drawing>
+      </w:r>
+    </w:p>
+    <w:p>
+      <w:pPr>
+        <w:pStyle w:val="BodyText"/>
+        <w:bidi w:val="0"/>
+        <w:spacing w:lineRule="auto" w:line="276" w:before="0" w:after="140"/>
+        <w:jc w:val="start"/>
+        <w:rPr/>
+      </w:pPr>
+      <w:r>
+        <w:rPr/>
+      </w:r>
+    </w:p>
+    <w:p>
+      <w:pPr>
+        <w:pStyle w:val="BodyText"/>
+        <w:bidi w:val="0"/>
+        <w:spacing w:lineRule="auto" w:line="276" w:before="0" w:after="140"/>
+        <w:jc w:val="start"/>
+        <w:rPr/>
+      </w:pPr>
+      <w:r>
+        <w:rPr/>
+        <w:t>Presovani zamestnancu nebo podrizenych managera</w:t>
+      </w:r>
+    </w:p>
+    <w:p>
+      <w:pPr>
+        <w:pStyle w:val="BodyText"/>
+        <w:bidi w:val="0"/>
+        <w:spacing w:lineRule="auto" w:line="276" w:before="0" w:after="140"/>
+        <w:jc w:val="start"/>
+        <w:rPr/>
+      </w:pPr>
+      <w:r>
+        <w:rPr/>
+        <w:drawing>
+          <wp:anchor distT="0" distB="0" distL="0" distR="0" simplePos="0" relativeHeight="11" behindDoc="0" locked="0" layoutInCell="0" allowOverlap="1">
+            <wp:simplePos x="0" y="0"/>
+            <wp:positionH relativeFrom="column">
+              <wp:posOffset>53975</wp:posOffset>
+            </wp:positionH>
+            <wp:positionV relativeFrom="paragraph">
+              <wp:posOffset>183515</wp:posOffset>
+            </wp:positionV>
+            <wp:extent cx="6120130" cy="3824605"/>
+            <wp:effectExtent l="0" t="0" r="0" b="0"/>
+            <wp:wrapSquare wrapText="largest"/>
+            <wp:docPr id="11" name="Image10"/>
+            <wp:cNvGraphicFramePr>
+              <a:graphicFrameLocks xmlns:a="http://schemas.openxmlformats.org/drawingml/2006/main" noChangeAspect="1"/>
+            </wp:cNvGraphicFramePr>
+            <a:graphic xmlns:a="http://schemas.openxmlformats.org/drawingml/2006/main">
+              <a:graphicData uri="http://schemas.openxmlformats.org/drawingml/2006/picture">
+                <pic:pic xmlns:pic="http://schemas.openxmlformats.org/drawingml/2006/picture">
+                  <pic:nvPicPr>
+                    <pic:cNvPr id="11" name="Image10"/>
+                    <pic:cNvPicPr>
+                      <a:picLocks noChangeAspect="1" noChangeArrowheads="1"/>
+                    </pic:cNvPicPr>
+                  </pic:nvPicPr>
+                  <pic:blipFill>
+                    <a:blip r:embed="rId12"/>
+                    <a:stretch>
+                      <a:fillRect/>
+                    </a:stretch>
+                  </pic:blipFill>
+                  <pic:spPr bwMode="auto">
+                    <a:xfrm>
+                      <a:off x="0" y="0"/>
+                      <a:ext cx="6120130" cy="3824605"/>
+                    </a:xfrm>
+                    <a:prstGeom prst="rect">
+                      <a:avLst/>
+                    </a:prstGeom>
+                    <a:noFill/>
+                  </pic:spPr>
+                </pic:pic>
+              </a:graphicData>
+            </a:graphic>
+          </wp:anchor>
+        </w:drawing>
       </w:r>
     </w:p>
     <w:sectPr>
@@ -953,7 +1046,6 @@
     </w:rPrDefault>
     <w:pPrDefault>
       <w:pPr>
-        <w:widowControl/>
         <w:suppressAutoHyphens w:val="true"/>
       </w:pPr>
     </w:pPrDefault>
@@ -963,10 +1055,11 @@
     <w:qFormat/>
     <w:pPr>
       <w:widowControl/>
-      <w:kinsoku w:val="true"/>
-      <w:overflowPunct w:val="true"/>
-      <w:autoSpaceDE w:val="true"/>
+      <w:suppressAutoHyphens w:val="true"/>
+      <w:overflowPunct w:val="false"/>
       <w:bidi w:val="0"/>
+      <w:spacing w:before="0" w:after="0"/>
+      <w:jc w:val="start"/>
     </w:pPr>
     <w:rPr>
       <w:rFonts w:ascii="Liberation Serif" w:hAnsi="Liberation Serif" w:eastAsia="Noto Serif CJK SC" w:cs="Noto Sans Devanagari"/>

</xml_diff>